<commit_message>
docs(cesu): spell out the acronyms in the CESU guides
Adds an abbreviations table at the top of both guides and a "What the
columns mean" list under the Prophet accuracy table (MAPE, RMSE with small
worked examples, last-year guess, ILI, HFMD).

Co-Authored-By: Claude Opus 5.5 <noreply@anthropic.com>
</commit_message>
<xml_diff>
--- a/docs/cesu_guides/HMAP_Prophet_Forecast_Guide.docx
+++ b/docs/cesu_guides/HMAP_Prophet_Forecast_Guide.docx
@@ -21,6 +21,316 @@
         <w:t>How the forecast works, how the CESU should read it, and how accurate it has been on Parañaque data</w:t>
       </w:r>
     </w:p>
+    <w:p>
+      <w:pPr>
+        <w:pStyle w:val="Heading2"/>
+      </w:pPr>
+      <w:r>
+        <w:t>Abbreviations used</w:t>
+      </w:r>
+    </w:p>
+    <w:tbl>
+      <w:tblPr>
+        <w:tblStyle w:val="TableGrid"/>
+        <w:tblW w:type="auto" w:w="0"/>
+        <w:jc w:val="center"/>
+        <w:tblLook w:firstColumn="1" w:firstRow="1" w:lastColumn="0" w:lastRow="0" w:noHBand="0" w:noVBand="1" w:val="04A0"/>
+      </w:tblPr>
+      <w:tblGrid>
+        <w:gridCol w:w="4680"/>
+        <w:gridCol w:w="4680"/>
+      </w:tblGrid>
+      <w:tr>
+        <w:trPr>
+          <w:tblHeader w:val="true"/>
+        </w:trPr>
+        <w:tc>
+          <w:tcPr>
+            <w:tcW w:type="dxa" w:w="1872"/>
+            <w:shd w:val="clear" w:color="auto" w:fill="DBEAFE"/>
+          </w:tcPr>
+          <w:p>
+            <w:pPr>
+              <w:keepNext/>
+            </w:pPr>
+            <w:r/>
+            <w:r>
+              <w:rPr>
+                <w:b/>
+                <w:sz w:val="19"/>
+              </w:rPr>
+              <w:t>Abbreviation</w:t>
+            </w:r>
+          </w:p>
+        </w:tc>
+        <w:tc>
+          <w:tcPr>
+            <w:tcW w:type="dxa" w:w="7488"/>
+            <w:shd w:val="clear" w:color="auto" w:fill="DBEAFE"/>
+          </w:tcPr>
+          <w:p>
+            <w:pPr>
+              <w:keepNext/>
+            </w:pPr>
+            <w:r/>
+            <w:r>
+              <w:rPr>
+                <w:b/>
+                <w:sz w:val="19"/>
+              </w:rPr>
+              <w:t>Meaning</w:t>
+            </w:r>
+          </w:p>
+        </w:tc>
+      </w:tr>
+      <w:tr>
+        <w:tc>
+          <w:tcPr>
+            <w:tcW w:type="dxa" w:w="1872"/>
+          </w:tcPr>
+          <w:p>
+            <w:pPr>
+              <w:keepNext/>
+            </w:pPr>
+            <w:r/>
+            <w:r>
+              <w:rPr>
+                <w:sz w:val="19"/>
+              </w:rPr>
+              <w:t>MAPE</w:t>
+            </w:r>
+          </w:p>
+        </w:tc>
+        <w:tc>
+          <w:tcPr>
+            <w:tcW w:type="dxa" w:w="7488"/>
+          </w:tcPr>
+          <w:p>
+            <w:pPr>
+              <w:keepNext/>
+            </w:pPr>
+            <w:r/>
+            <w:r>
+              <w:rPr>
+                <w:sz w:val="19"/>
+              </w:rPr>
+              <w:t>Mean Absolute Percentage Error (average miss per week, in percent)</w:t>
+            </w:r>
+          </w:p>
+        </w:tc>
+      </w:tr>
+      <w:tr>
+        <w:tc>
+          <w:tcPr>
+            <w:tcW w:type="dxa" w:w="1872"/>
+          </w:tcPr>
+          <w:p>
+            <w:pPr>
+              <w:keepNext/>
+            </w:pPr>
+            <w:r/>
+            <w:r>
+              <w:rPr>
+                <w:sz w:val="19"/>
+              </w:rPr>
+              <w:t>RMSE</w:t>
+            </w:r>
+          </w:p>
+        </w:tc>
+        <w:tc>
+          <w:tcPr>
+            <w:tcW w:type="dxa" w:w="7488"/>
+          </w:tcPr>
+          <w:p>
+            <w:pPr>
+              <w:keepNext/>
+            </w:pPr>
+            <w:r/>
+            <w:r>
+              <w:rPr>
+                <w:sz w:val="19"/>
+              </w:rPr>
+              <w:t>Root Mean Square Error (typical miss per week, in cases)</w:t>
+            </w:r>
+          </w:p>
+        </w:tc>
+      </w:tr>
+      <w:tr>
+        <w:tc>
+          <w:tcPr>
+            <w:tcW w:type="dxa" w:w="1872"/>
+          </w:tcPr>
+          <w:p>
+            <w:pPr>
+              <w:keepNext/>
+            </w:pPr>
+            <w:r/>
+            <w:r>
+              <w:rPr>
+                <w:sz w:val="19"/>
+              </w:rPr>
+              <w:t>MAE</w:t>
+            </w:r>
+          </w:p>
+        </w:tc>
+        <w:tc>
+          <w:tcPr>
+            <w:tcW w:type="dxa" w:w="7488"/>
+          </w:tcPr>
+          <w:p>
+            <w:pPr>
+              <w:keepNext/>
+            </w:pPr>
+            <w:r/>
+            <w:r>
+              <w:rPr>
+                <w:sz w:val="19"/>
+              </w:rPr>
+              <w:t>Mean Absolute Error (average miss per week, in cases)</w:t>
+            </w:r>
+          </w:p>
+        </w:tc>
+      </w:tr>
+      <w:tr>
+        <w:tc>
+          <w:tcPr>
+            <w:tcW w:type="dxa" w:w="1872"/>
+          </w:tcPr>
+          <w:p>
+            <w:pPr>
+              <w:keepNext/>
+            </w:pPr>
+            <w:r/>
+            <w:r>
+              <w:rPr>
+                <w:sz w:val="19"/>
+              </w:rPr>
+              <w:t>ILI</w:t>
+            </w:r>
+          </w:p>
+        </w:tc>
+        <w:tc>
+          <w:tcPr>
+            <w:tcW w:type="dxa" w:w="7488"/>
+          </w:tcPr>
+          <w:p>
+            <w:pPr>
+              <w:keepNext/>
+            </w:pPr>
+            <w:r/>
+            <w:r>
+              <w:rPr>
+                <w:sz w:val="19"/>
+              </w:rPr>
+              <w:t>Influenza-like illness</w:t>
+            </w:r>
+          </w:p>
+        </w:tc>
+      </w:tr>
+      <w:tr>
+        <w:tc>
+          <w:tcPr>
+            <w:tcW w:type="dxa" w:w="1872"/>
+          </w:tcPr>
+          <w:p>
+            <w:pPr>
+              <w:keepNext/>
+            </w:pPr>
+            <w:r/>
+            <w:r>
+              <w:rPr>
+                <w:sz w:val="19"/>
+              </w:rPr>
+              <w:t>HFMD</w:t>
+            </w:r>
+          </w:p>
+        </w:tc>
+        <w:tc>
+          <w:tcPr>
+            <w:tcW w:type="dxa" w:w="7488"/>
+          </w:tcPr>
+          <w:p>
+            <w:pPr>
+              <w:keepNext/>
+            </w:pPr>
+            <w:r/>
+            <w:r>
+              <w:rPr>
+                <w:sz w:val="19"/>
+              </w:rPr>
+              <w:t>Hand, foot and mouth disease</w:t>
+            </w:r>
+          </w:p>
+        </w:tc>
+      </w:tr>
+      <w:tr>
+        <w:tc>
+          <w:tcPr>
+            <w:tcW w:type="dxa" w:w="1872"/>
+          </w:tcPr>
+          <w:p>
+            <w:pPr>
+              <w:keepNext/>
+            </w:pPr>
+            <w:r/>
+            <w:r>
+              <w:rPr>
+                <w:sz w:val="19"/>
+              </w:rPr>
+              <w:t>TYP / LEP</w:t>
+            </w:r>
+          </w:p>
+        </w:tc>
+        <w:tc>
+          <w:tcPr>
+            <w:tcW w:type="dxa" w:w="7488"/>
+          </w:tcPr>
+          <w:p>
+            <w:pPr>
+              <w:keepNext/>
+            </w:pPr>
+            <w:r/>
+            <w:r>
+              <w:rPr>
+                <w:sz w:val="19"/>
+              </w:rPr>
+              <w:t>Typhoid / Leptospirosis</w:t>
+            </w:r>
+          </w:p>
+        </w:tc>
+      </w:tr>
+      <w:tr>
+        <w:tc>
+          <w:tcPr>
+            <w:tcW w:type="dxa" w:w="1872"/>
+          </w:tcPr>
+          <w:p>
+            <w:r/>
+            <w:r>
+              <w:rPr>
+                <w:sz w:val="19"/>
+              </w:rPr>
+              <w:t>CESU</w:t>
+            </w:r>
+          </w:p>
+        </w:tc>
+        <w:tc>
+          <w:tcPr>
+            <w:tcW w:type="dxa" w:w="7488"/>
+          </w:tcPr>
+          <w:p>
+            <w:r/>
+            <w:r>
+              <w:rPr>
+                <w:sz w:val="19"/>
+              </w:rPr>
+              <w:t>City Epidemiology and Surveillance Unit</w:t>
+            </w:r>
+          </w:p>
+        </w:tc>
+      </w:tr>
+    </w:tbl>
+    <w:p/>
     <w:p>
       <w:pPr>
         <w:pStyle w:val="Heading1"/>
@@ -912,17 +1222,130 @@
     <w:p>
       <w:r>
         <w:rPr>
+          <w:b/>
           <w:i w:val="0"/>
         </w:rPr>
-        <w:t>Why three diseases are withheld: Measles and HFMD have mostly zero weeks with occasional bursts, and influenza-like illness depends on which strains circulate in a given year. None of them follows a regular yearly pattern that Prophet can learn, so for these the CESU should rely on the thresholds and the single-case rule.</w:t>
+        <w:t>What the columns mean:</w:t>
+      </w:r>
+    </w:p>
+    <w:p>
+      <w:pPr>
+        <w:pStyle w:val="ListBullet"/>
+      </w:pPr>
+      <w:r>
+        <w:rPr>
+          <w:b/>
+        </w:rPr>
+        <w:t xml:space="preserve">MAPE (Mean Absolute Percentage Error): </w:t>
+      </w:r>
+      <w:r>
+        <w:t>the average miss per week, as a percentage of the actual count. H-MAP adds 1 to the actual count before dividing, so weeks with 0 cases do not make the percentage infinite. Example: 40 actual cases and a forecast of 30 is a miss of 10 / (40 + 1) = 24.4%.</w:t>
+      </w:r>
+    </w:p>
+    <w:p>
+      <w:pPr>
+        <w:pStyle w:val="ListBullet"/>
+      </w:pPr>
+      <w:r>
+        <w:rPr>
+          <w:b/>
+        </w:rPr>
+        <w:t xml:space="preserve">RMSE (Root Mean Square Error): </w:t>
+      </w:r>
+      <w:r>
+        <w:t>the typical miss in number of cases per week. Each week's miss is squared, averaged, then square-rooted, so one large miss counts more than several small ones. Example: misses of 2 and 4 cases give the square root of (4 + 16) / 2 = 3.16 cases.</w:t>
+      </w:r>
+    </w:p>
+    <w:p>
+      <w:pPr>
+        <w:pStyle w:val="ListBullet"/>
+      </w:pPr>
+      <w:r>
+        <w:rPr>
+          <w:b/>
+        </w:rPr>
+        <w:t xml:space="preserve">Prophet error: </w:t>
+      </w:r>
+      <w:r>
+        <w:t>how far the H-MAP forecast was from the actual weekly counts in 2024 and 2025.</w:t>
+      </w:r>
+    </w:p>
+    <w:p>
+      <w:pPr>
+        <w:pStyle w:val="ListBullet"/>
+      </w:pPr>
+      <w:r>
+        <w:rPr>
+          <w:b/>
+        </w:rPr>
+        <w:t xml:space="preserve">Last-year error: </w:t>
+      </w:r>
+      <w:r>
+        <w:t>how far the simple guess "same week last year" (also called the seasonal-naive forecast) was from the same actual counts.</w:t>
+      </w:r>
+    </w:p>
+    <w:p>
+      <w:pPr>
+        <w:pStyle w:val="ListBullet"/>
+      </w:pPr>
+      <w:r>
+        <w:rPr>
+          <w:b/>
+        </w:rPr>
+        <w:t xml:space="preserve">On the dashboard: </w:t>
+      </w:r>
+      <w:r>
+        <w:t>"Shown" when Prophet's MAPE is lower than the last-year MAPE, otherwise "Withheld". For both measures, lower is better.</w:t>
+      </w:r>
+    </w:p>
+    <w:p>
+      <w:pPr>
+        <w:pStyle w:val="ListBullet"/>
+      </w:pPr>
+      <w:r>
+        <w:rPr>
+          <w:b/>
+        </w:rPr>
+        <w:t xml:space="preserve">ILI: </w:t>
+      </w:r>
+      <w:r>
+        <w:t>Influenza-like illness.</w:t>
+      </w:r>
+    </w:p>
+    <w:p>
+      <w:pPr>
+        <w:pStyle w:val="ListBullet"/>
+      </w:pPr>
+      <w:r>
+        <w:rPr>
+          <w:b/>
+        </w:rPr>
+        <w:t xml:space="preserve">HFMD: </w:t>
+      </w:r>
+      <w:r>
+        <w:t>Hand, foot and mouth disease.</w:t>
+      </w:r>
+    </w:p>
+    <w:p>
+      <w:pPr>
+        <w:pStyle w:val="ListBullet"/>
+      </w:pPr>
+      <w:r>
+        <w:rPr>
+          <w:b/>
+        </w:rPr>
+        <w:t xml:space="preserve">City-wide: </w:t>
+      </w:r>
+      <w:r>
+        <w:t>all 16 barangays counted together.</w:t>
       </w:r>
     </w:p>
     <w:p>
       <w:r>
         <w:rPr>
-          <w:i/>
+          <w:i w:val="0"/>
         </w:rPr>
-        <w:t>Reading the error columns. MAPE is the average percentage miss per week. H-MAP adds 1 to the actual count before dividing, so weeks with 0 cases do not make the percentage infinite. RMSE is the typical miss in cases per week, with large misses counting more. Lower is better for both.</w:t>
+        <w:t>Why three diseases are withheld: Measles and HFMD have mostly zero weeks with occasional bursts, and influenza-like illness depends on which strains circulate in a given year. None of them follows a regular yearly pattern that Prophet can learn, so for these the CESU should rely on the thresholds and the single-case rule.</w:t>
       </w:r>
     </w:p>
     <w:p>
@@ -1096,7 +1519,6 @@
           <w:p>
             <w:pPr>
               <w:keepNext/>
-              <w:jc w:val="center"/>
             </w:pPr>
             <w:r/>
             <w:r>
@@ -1133,7 +1555,6 @@
           <w:p>
             <w:pPr>
               <w:keepNext/>
-              <w:jc w:val="center"/>
             </w:pPr>
             <w:r/>
             <w:r>
@@ -1170,7 +1591,6 @@
           <w:p>
             <w:pPr>
               <w:keepNext/>
-              <w:jc w:val="center"/>
             </w:pPr>
             <w:r/>
             <w:r>
@@ -1202,9 +1622,6 @@
             <w:tcW w:type="dxa" w:w="4896"/>
           </w:tcPr>
           <w:p>
-            <w:pPr>
-              <w:jc w:val="center"/>
-            </w:pPr>
             <w:r/>
             <w:r>
               <w:rPr>

</xml_diff>

<commit_message>
docs(cesu): document what the forecast models learned and how they were tested
New Section 3 in the Prophet guide: training years (2010-2025, 2026 not yet learned), weeks per disease, the two hold-out tests side by side, and Section 7 on what is not yet tested with a live validation plan.

Co-Authored-By: Claude Opus 5.5 <noreply@anthropic.com>
</commit_message>
<xml_diff>
--- a/docs/cesu_guides/HMAP_Prophet_Forecast_Guide.docx
+++ b/docs/cesu_guides/HMAP_Prophet_Forecast_Guide.docx
@@ -392,7 +392,7 @@
         <w:pStyle w:val="ListNumber"/>
       </w:pPr>
       <w:r>
-        <w:t>Range. Prophet also gives an 80% range (lower and upper bound). In principle, about 4 out of 5 future weeks should fall inside it. Section 5 shows how well that held on Parañaque data.</w:t>
+        <w:t>Range. Prophet also gives an 80% range (lower and upper bound). In principle, about 4 out of 5 future weeks should fall inside it. Section 6 shows how well that held on Parañaque data.</w:t>
       </w:r>
     </w:p>
     <w:p>
@@ -408,7 +408,15 @@
         <w:pStyle w:val="Heading1"/>
       </w:pPr>
       <w:r>
-        <w:t>3. When H-MAP shows a forecast and when it does not</w:t>
+        <w:t>3. What the AI learned, and how it was tested</w:t>
+      </w:r>
+    </w:p>
+    <w:p>
+      <w:pPr>
+        <w:pStyle w:val="Heading2"/>
+      </w:pPr>
+      <w:r>
+        <w:t>3.1 The data it learned from</w:t>
       </w:r>
     </w:p>
     <w:p>
@@ -416,7 +424,1144 @@
         <w:rPr>
           <w:i w:val="0"/>
         </w:rPr>
-        <w:t>Before a forecast is shown, H-MAP tests it. The model is trained on 2010 to 2023 only, asked to predict 2024 and 2025, and compared with what actually happened. The same test is given to the simplest possible guess: the same week last year. If Prophet does not beat that guess, the forecast is withheld and the dashboard says so.</w:t>
+        <w:t>Each model learns from one thing only: the number of Confirmed + Probable cases of one disease in each morbidity week, taken from the CESU PIDSR registry. It does not see names, addresses, ages or any other case details.</w:t>
+      </w:r>
+    </w:p>
+    <w:tbl>
+      <w:tblPr>
+        <w:tblStyle w:val="TableGrid"/>
+        <w:tblW w:type="auto" w:w="0"/>
+        <w:jc w:val="center"/>
+        <w:tblLook w:firstColumn="1" w:firstRow="1" w:lastColumn="0" w:lastRow="0" w:noHBand="0" w:noVBand="1" w:val="04A0"/>
+      </w:tblPr>
+      <w:tblGrid>
+        <w:gridCol w:w="4680"/>
+        <w:gridCol w:w="4680"/>
+      </w:tblGrid>
+      <w:tr>
+        <w:trPr>
+          <w:tblHeader w:val="true"/>
+        </w:trPr>
+        <w:tc>
+          <w:tcPr>
+            <w:tcW w:type="dxa" w:w="3456"/>
+            <w:shd w:val="clear" w:color="auto" w:fill="DBEAFE"/>
+          </w:tcPr>
+          <w:p>
+            <w:pPr>
+              <w:keepNext/>
+            </w:pPr>
+            <w:r/>
+            <w:r>
+              <w:rPr>
+                <w:b/>
+                <w:sz w:val="19"/>
+              </w:rPr>
+              <w:t>Item</w:t>
+            </w:r>
+          </w:p>
+        </w:tc>
+        <w:tc>
+          <w:tcPr>
+            <w:tcW w:type="dxa" w:w="5904"/>
+            <w:shd w:val="clear" w:color="auto" w:fill="DBEAFE"/>
+          </w:tcPr>
+          <w:p>
+            <w:pPr>
+              <w:keepNext/>
+            </w:pPr>
+            <w:r/>
+            <w:r>
+              <w:rPr>
+                <w:b/>
+                <w:sz w:val="19"/>
+              </w:rPr>
+              <w:t>What the models use</w:t>
+            </w:r>
+          </w:p>
+        </w:tc>
+      </w:tr>
+      <w:tr>
+        <w:tc>
+          <w:tcPr>
+            <w:tcW w:type="dxa" w:w="3456"/>
+          </w:tcPr>
+          <w:p>
+            <w:pPr>
+              <w:keepNext/>
+            </w:pPr>
+            <w:r/>
+            <w:r>
+              <w:rPr>
+                <w:sz w:val="19"/>
+              </w:rPr>
+              <w:t>Years learned (models on the dashboard)</w:t>
+            </w:r>
+          </w:p>
+        </w:tc>
+        <w:tc>
+          <w:tcPr>
+            <w:tcW w:type="dxa" w:w="5904"/>
+          </w:tcPr>
+          <w:p>
+            <w:pPr>
+              <w:keepNext/>
+            </w:pPr>
+            <w:r/>
+            <w:r>
+              <w:rPr>
+                <w:sz w:val="19"/>
+              </w:rPr>
+              <w:t>2010 to 2025 (16 years)</w:t>
+            </w:r>
+          </w:p>
+        </w:tc>
+      </w:tr>
+      <w:tr>
+        <w:tc>
+          <w:tcPr>
+            <w:tcW w:type="dxa" w:w="3456"/>
+          </w:tcPr>
+          <w:p>
+            <w:pPr>
+              <w:keepNext/>
+            </w:pPr>
+            <w:r/>
+            <w:r>
+              <w:rPr>
+                <w:sz w:val="19"/>
+              </w:rPr>
+              <w:t>Years not yet learned</w:t>
+            </w:r>
+          </w:p>
+        </w:tc>
+        <w:tc>
+          <w:tcPr>
+            <w:tcW w:type="dxa" w:w="5904"/>
+          </w:tcPr>
+          <w:p>
+            <w:pPr>
+              <w:keepNext/>
+            </w:pPr>
+            <w:r/>
+            <w:r>
+              <w:rPr>
+                <w:sz w:val="19"/>
+              </w:rPr>
+              <w:t>2026 (left out until it is a full year, or until the model is retrained)</w:t>
+            </w:r>
+          </w:p>
+        </w:tc>
+      </w:tr>
+      <w:tr>
+        <w:tc>
+          <w:tcPr>
+            <w:tcW w:type="dxa" w:w="3456"/>
+          </w:tcPr>
+          <w:p>
+            <w:pPr>
+              <w:keepNext/>
+            </w:pPr>
+            <w:r/>
+            <w:r>
+              <w:rPr>
+                <w:sz w:val="19"/>
+              </w:rPr>
+              <w:t>Unit</w:t>
+            </w:r>
+          </w:p>
+        </w:tc>
+        <w:tc>
+          <w:tcPr>
+            <w:tcW w:type="dxa" w:w="5904"/>
+          </w:tcPr>
+          <w:p>
+            <w:pPr>
+              <w:keepNext/>
+            </w:pPr>
+            <w:r/>
+            <w:r>
+              <w:rPr>
+                <w:sz w:val="19"/>
+              </w:rPr>
+              <w:t>Weekly counts per morbidity week, city-wide; dengue also per barangay</w:t>
+            </w:r>
+          </w:p>
+        </w:tc>
+      </w:tr>
+      <w:tr>
+        <w:tc>
+          <w:tcPr>
+            <w:tcW w:type="dxa" w:w="3456"/>
+          </w:tcPr>
+          <w:p>
+            <w:pPr>
+              <w:keepNext/>
+            </w:pPr>
+            <w:r/>
+            <w:r>
+              <w:rPr>
+                <w:sz w:val="19"/>
+              </w:rPr>
+              <w:t>Cases counted</w:t>
+            </w:r>
+          </w:p>
+        </w:tc>
+        <w:tc>
+          <w:tcPr>
+            <w:tcW w:type="dxa" w:w="5904"/>
+          </w:tcPr>
+          <w:p>
+            <w:pPr>
+              <w:keepNext/>
+            </w:pPr>
+            <w:r/>
+            <w:r>
+              <w:rPr>
+                <w:sz w:val="19"/>
+              </w:rPr>
+              <w:t>Confirmed and Probable only (same as the PIDSR thresholds)</w:t>
+            </w:r>
+          </w:p>
+        </w:tc>
+      </w:tr>
+      <w:tr>
+        <w:tc>
+          <w:tcPr>
+            <w:tcW w:type="dxa" w:w="3456"/>
+          </w:tcPr>
+          <w:p>
+            <w:r/>
+            <w:r>
+              <w:rPr>
+                <w:sz w:val="19"/>
+              </w:rPr>
+              <w:t>Unusual years inside the data</w:t>
+            </w:r>
+          </w:p>
+        </w:tc>
+        <w:tc>
+          <w:tcPr>
+            <w:tcW w:type="dxa" w:w="5904"/>
+          </w:tcPr>
+          <w:p>
+            <w:r/>
+            <w:r>
+              <w:rPr>
+                <w:sz w:val="19"/>
+              </w:rPr>
+              <w:t>2019 dengue outbreak; 2020-2021 COVID-19 lockdowns (very few reports)</w:t>
+            </w:r>
+          </w:p>
+        </w:tc>
+      </w:tr>
+    </w:tbl>
+    <w:p/>
+    <w:tbl>
+      <w:tblPr>
+        <w:tblStyle w:val="TableGrid"/>
+        <w:tblW w:type="auto" w:w="0"/>
+        <w:jc w:val="center"/>
+        <w:tblLook w:firstColumn="1" w:firstRow="1" w:lastColumn="0" w:lastRow="0" w:noHBand="0" w:noVBand="1" w:val="04A0"/>
+      </w:tblPr>
+      <w:tblGrid>
+        <w:gridCol w:w="2340"/>
+        <w:gridCol w:w="2340"/>
+        <w:gridCol w:w="2340"/>
+        <w:gridCol w:w="2340"/>
+      </w:tblGrid>
+      <w:tr>
+        <w:trPr>
+          <w:tblHeader w:val="true"/>
+        </w:trPr>
+        <w:tc>
+          <w:tcPr>
+            <w:tcW w:type="dxa" w:w="2736"/>
+            <w:shd w:val="clear" w:color="auto" w:fill="DBEAFE"/>
+          </w:tcPr>
+          <w:p>
+            <w:pPr>
+              <w:keepNext/>
+            </w:pPr>
+            <w:r/>
+            <w:r>
+              <w:rPr>
+                <w:b/>
+                <w:sz w:val="19"/>
+              </w:rPr>
+              <w:t>Disease (city-wide)</w:t>
+            </w:r>
+          </w:p>
+        </w:tc>
+        <w:tc>
+          <w:tcPr>
+            <w:tcW w:type="dxa" w:w="2160"/>
+            <w:shd w:val="clear" w:color="auto" w:fill="DBEAFE"/>
+          </w:tcPr>
+          <w:p>
+            <w:pPr>
+              <w:keepNext/>
+            </w:pPr>
+            <w:r/>
+            <w:r>
+              <w:rPr>
+                <w:b/>
+                <w:sz w:val="19"/>
+              </w:rPr>
+              <w:t>Weeks learned, 2010-2025</w:t>
+            </w:r>
+          </w:p>
+        </w:tc>
+        <w:tc>
+          <w:tcPr>
+            <w:tcW w:type="dxa" w:w="2304"/>
+            <w:shd w:val="clear" w:color="auto" w:fill="DBEAFE"/>
+          </w:tcPr>
+          <w:p>
+            <w:pPr>
+              <w:keepNext/>
+            </w:pPr>
+            <w:r/>
+            <w:r>
+              <w:rPr>
+                <w:b/>
+                <w:sz w:val="19"/>
+              </w:rPr>
+              <w:t>Weeks used to learn in the test (to 2023)</w:t>
+            </w:r>
+          </w:p>
+        </w:tc>
+        <w:tc>
+          <w:tcPr>
+            <w:tcW w:type="dxa" w:w="2160"/>
+            <w:shd w:val="clear" w:color="auto" w:fill="DBEAFE"/>
+          </w:tcPr>
+          <w:p>
+            <w:pPr>
+              <w:keepNext/>
+            </w:pPr>
+            <w:r/>
+            <w:r>
+              <w:rPr>
+                <w:b/>
+                <w:sz w:val="19"/>
+              </w:rPr>
+              <w:t>Weeks hidden and predicted (2024-2025)</w:t>
+            </w:r>
+          </w:p>
+        </w:tc>
+      </w:tr>
+      <w:tr>
+        <w:tc>
+          <w:tcPr>
+            <w:tcW w:type="dxa" w:w="2736"/>
+          </w:tcPr>
+          <w:p>
+            <w:pPr>
+              <w:keepNext/>
+            </w:pPr>
+            <w:r/>
+            <w:r>
+              <w:rPr>
+                <w:sz w:val="19"/>
+              </w:rPr>
+              <w:t>Dengue</w:t>
+            </w:r>
+          </w:p>
+        </w:tc>
+        <w:tc>
+          <w:tcPr>
+            <w:tcW w:type="dxa" w:w="2160"/>
+          </w:tcPr>
+          <w:p>
+            <w:pPr>
+              <w:keepNext/>
+              <w:jc w:val="center"/>
+            </w:pPr>
+            <w:r/>
+            <w:r>
+              <w:rPr>
+                <w:sz w:val="19"/>
+              </w:rPr>
+              <w:t>824</w:t>
+            </w:r>
+          </w:p>
+        </w:tc>
+        <w:tc>
+          <w:tcPr>
+            <w:tcW w:type="dxa" w:w="2304"/>
+          </w:tcPr>
+          <w:p>
+            <w:pPr>
+              <w:keepNext/>
+              <w:jc w:val="center"/>
+            </w:pPr>
+            <w:r/>
+            <w:r>
+              <w:rPr>
+                <w:sz w:val="19"/>
+              </w:rPr>
+              <w:t>720</w:t>
+            </w:r>
+          </w:p>
+        </w:tc>
+        <w:tc>
+          <w:tcPr>
+            <w:tcW w:type="dxa" w:w="2160"/>
+          </w:tcPr>
+          <w:p>
+            <w:pPr>
+              <w:keepNext/>
+              <w:jc w:val="center"/>
+            </w:pPr>
+            <w:r/>
+            <w:r>
+              <w:rPr>
+                <w:sz w:val="19"/>
+              </w:rPr>
+              <w:t>104</w:t>
+            </w:r>
+          </w:p>
+        </w:tc>
+      </w:tr>
+      <w:tr>
+        <w:tc>
+          <w:tcPr>
+            <w:tcW w:type="dxa" w:w="2736"/>
+          </w:tcPr>
+          <w:p>
+            <w:pPr>
+              <w:keepNext/>
+            </w:pPr>
+            <w:r/>
+            <w:r>
+              <w:rPr>
+                <w:sz w:val="19"/>
+              </w:rPr>
+              <w:t>Influenza-like illness</w:t>
+            </w:r>
+          </w:p>
+        </w:tc>
+        <w:tc>
+          <w:tcPr>
+            <w:tcW w:type="dxa" w:w="2160"/>
+          </w:tcPr>
+          <w:p>
+            <w:pPr>
+              <w:keepNext/>
+              <w:jc w:val="center"/>
+            </w:pPr>
+            <w:r/>
+            <w:r>
+              <w:rPr>
+                <w:sz w:val="19"/>
+              </w:rPr>
+              <w:t>797</w:t>
+            </w:r>
+          </w:p>
+        </w:tc>
+        <w:tc>
+          <w:tcPr>
+            <w:tcW w:type="dxa" w:w="2304"/>
+          </w:tcPr>
+          <w:p>
+            <w:pPr>
+              <w:keepNext/>
+              <w:jc w:val="center"/>
+            </w:pPr>
+            <w:r/>
+            <w:r>
+              <w:rPr>
+                <w:sz w:val="19"/>
+              </w:rPr>
+              <w:t>701</w:t>
+            </w:r>
+          </w:p>
+        </w:tc>
+        <w:tc>
+          <w:tcPr>
+            <w:tcW w:type="dxa" w:w="2160"/>
+          </w:tcPr>
+          <w:p>
+            <w:pPr>
+              <w:keepNext/>
+              <w:jc w:val="center"/>
+            </w:pPr>
+            <w:r/>
+            <w:r>
+              <w:rPr>
+                <w:sz w:val="19"/>
+              </w:rPr>
+              <w:t>96</w:t>
+            </w:r>
+          </w:p>
+        </w:tc>
+      </w:tr>
+      <w:tr>
+        <w:tc>
+          <w:tcPr>
+            <w:tcW w:type="dxa" w:w="2736"/>
+          </w:tcPr>
+          <w:p>
+            <w:pPr>
+              <w:keepNext/>
+            </w:pPr>
+            <w:r/>
+            <w:r>
+              <w:rPr>
+                <w:sz w:val="19"/>
+              </w:rPr>
+              <w:t>Measles</w:t>
+            </w:r>
+          </w:p>
+        </w:tc>
+        <w:tc>
+          <w:tcPr>
+            <w:tcW w:type="dxa" w:w="2160"/>
+          </w:tcPr>
+          <w:p>
+            <w:pPr>
+              <w:keepNext/>
+              <w:jc w:val="center"/>
+            </w:pPr>
+            <w:r/>
+            <w:r>
+              <w:rPr>
+                <w:sz w:val="19"/>
+              </w:rPr>
+              <w:t>834</w:t>
+            </w:r>
+          </w:p>
+        </w:tc>
+        <w:tc>
+          <w:tcPr>
+            <w:tcW w:type="dxa" w:w="2304"/>
+          </w:tcPr>
+          <w:p>
+            <w:pPr>
+              <w:keepNext/>
+              <w:jc w:val="center"/>
+            </w:pPr>
+            <w:r/>
+            <w:r>
+              <w:rPr>
+                <w:sz w:val="19"/>
+              </w:rPr>
+              <w:t>730</w:t>
+            </w:r>
+          </w:p>
+        </w:tc>
+        <w:tc>
+          <w:tcPr>
+            <w:tcW w:type="dxa" w:w="2160"/>
+          </w:tcPr>
+          <w:p>
+            <w:pPr>
+              <w:keepNext/>
+              <w:jc w:val="center"/>
+            </w:pPr>
+            <w:r/>
+            <w:r>
+              <w:rPr>
+                <w:sz w:val="19"/>
+              </w:rPr>
+              <w:t>104</w:t>
+            </w:r>
+          </w:p>
+        </w:tc>
+      </w:tr>
+      <w:tr>
+        <w:tc>
+          <w:tcPr>
+            <w:tcW w:type="dxa" w:w="2736"/>
+          </w:tcPr>
+          <w:p>
+            <w:pPr>
+              <w:keepNext/>
+            </w:pPr>
+            <w:r/>
+            <w:r>
+              <w:rPr>
+                <w:sz w:val="19"/>
+              </w:rPr>
+              <w:t>Typhoid</w:t>
+            </w:r>
+          </w:p>
+        </w:tc>
+        <w:tc>
+          <w:tcPr>
+            <w:tcW w:type="dxa" w:w="2160"/>
+          </w:tcPr>
+          <w:p>
+            <w:pPr>
+              <w:keepNext/>
+              <w:jc w:val="center"/>
+            </w:pPr>
+            <w:r/>
+            <w:r>
+              <w:rPr>
+                <w:sz w:val="19"/>
+              </w:rPr>
+              <w:t>781</w:t>
+            </w:r>
+          </w:p>
+        </w:tc>
+        <w:tc>
+          <w:tcPr>
+            <w:tcW w:type="dxa" w:w="2304"/>
+          </w:tcPr>
+          <w:p>
+            <w:pPr>
+              <w:keepNext/>
+              <w:jc w:val="center"/>
+            </w:pPr>
+            <w:r/>
+            <w:r>
+              <w:rPr>
+                <w:sz w:val="19"/>
+              </w:rPr>
+              <w:t>691</w:t>
+            </w:r>
+          </w:p>
+        </w:tc>
+        <w:tc>
+          <w:tcPr>
+            <w:tcW w:type="dxa" w:w="2160"/>
+          </w:tcPr>
+          <w:p>
+            <w:pPr>
+              <w:keepNext/>
+              <w:jc w:val="center"/>
+            </w:pPr>
+            <w:r/>
+            <w:r>
+              <w:rPr>
+                <w:sz w:val="19"/>
+              </w:rPr>
+              <w:t>90</w:t>
+            </w:r>
+          </w:p>
+        </w:tc>
+      </w:tr>
+      <w:tr>
+        <w:tc>
+          <w:tcPr>
+            <w:tcW w:type="dxa" w:w="2736"/>
+          </w:tcPr>
+          <w:p>
+            <w:pPr>
+              <w:keepNext/>
+            </w:pPr>
+            <w:r/>
+            <w:r>
+              <w:rPr>
+                <w:sz w:val="19"/>
+              </w:rPr>
+              <w:t>Leptospirosis</w:t>
+            </w:r>
+          </w:p>
+        </w:tc>
+        <w:tc>
+          <w:tcPr>
+            <w:tcW w:type="dxa" w:w="2160"/>
+          </w:tcPr>
+          <w:p>
+            <w:pPr>
+              <w:keepNext/>
+              <w:jc w:val="center"/>
+            </w:pPr>
+            <w:r/>
+            <w:r>
+              <w:rPr>
+                <w:sz w:val="19"/>
+              </w:rPr>
+              <w:t>706</w:t>
+            </w:r>
+          </w:p>
+        </w:tc>
+        <w:tc>
+          <w:tcPr>
+            <w:tcW w:type="dxa" w:w="2304"/>
+          </w:tcPr>
+          <w:p>
+            <w:pPr>
+              <w:keepNext/>
+              <w:jc w:val="center"/>
+            </w:pPr>
+            <w:r/>
+            <w:r>
+              <w:rPr>
+                <w:sz w:val="19"/>
+              </w:rPr>
+              <w:t>614</w:t>
+            </w:r>
+          </w:p>
+        </w:tc>
+        <w:tc>
+          <w:tcPr>
+            <w:tcW w:type="dxa" w:w="2160"/>
+          </w:tcPr>
+          <w:p>
+            <w:pPr>
+              <w:keepNext/>
+              <w:jc w:val="center"/>
+            </w:pPr>
+            <w:r/>
+            <w:r>
+              <w:rPr>
+                <w:sz w:val="19"/>
+              </w:rPr>
+              <w:t>92</w:t>
+            </w:r>
+          </w:p>
+        </w:tc>
+      </w:tr>
+      <w:tr>
+        <w:tc>
+          <w:tcPr>
+            <w:tcW w:type="dxa" w:w="2736"/>
+          </w:tcPr>
+          <w:p>
+            <w:r/>
+            <w:r>
+              <w:rPr>
+                <w:sz w:val="19"/>
+              </w:rPr>
+              <w:t>Hand, foot and mouth disease</w:t>
+            </w:r>
+          </w:p>
+        </w:tc>
+        <w:tc>
+          <w:tcPr>
+            <w:tcW w:type="dxa" w:w="2160"/>
+          </w:tcPr>
+          <w:p>
+            <w:pPr>
+              <w:jc w:val="center"/>
+            </w:pPr>
+            <w:r/>
+            <w:r>
+              <w:rPr>
+                <w:sz w:val="19"/>
+              </w:rPr>
+              <w:t>680</w:t>
+            </w:r>
+          </w:p>
+        </w:tc>
+        <w:tc>
+          <w:tcPr>
+            <w:tcW w:type="dxa" w:w="2304"/>
+          </w:tcPr>
+          <w:p>
+            <w:pPr>
+              <w:jc w:val="center"/>
+            </w:pPr>
+            <w:r/>
+            <w:r>
+              <w:rPr>
+                <w:sz w:val="19"/>
+              </w:rPr>
+              <w:t>597</w:t>
+            </w:r>
+          </w:p>
+        </w:tc>
+        <w:tc>
+          <w:tcPr>
+            <w:tcW w:type="dxa" w:w="2160"/>
+          </w:tcPr>
+          <w:p>
+            <w:pPr>
+              <w:jc w:val="center"/>
+            </w:pPr>
+            <w:r/>
+            <w:r>
+              <w:rPr>
+                <w:sz w:val="19"/>
+              </w:rPr>
+              <w:t>83</w:t>
+            </w:r>
+          </w:p>
+        </w:tc>
+      </w:tr>
+    </w:tbl>
+    <w:p/>
+    <w:p>
+      <w:r>
+        <w:rPr>
+          <w:i w:val="0"/>
+        </w:rPr>
+        <w:t>A disease's weekly series starts with its first reported case, so diseases first reported after 2010 have fewer weeks. In the test, the hidden 2024-2025 weeks were never shown to the model before it made its predictions.</w:t>
+      </w:r>
+    </w:p>
+    <w:p>
+      <w:pPr>
+        <w:pStyle w:val="Heading2"/>
+      </w:pPr>
+      <w:r>
+        <w:t>3.2 The two tests</w:t>
+      </w:r>
+    </w:p>
+    <w:p>
+      <w:r>
+        <w:rPr>
+          <w:i w:val="0"/>
+        </w:rPr>
+        <w:t>A forecast can only be judged fairly on weeks the model has never seen. Both tests hide the most recent years from the model, ask it to predict them, and then compare the predictions with what was actually reported. Each time, the model is also compared with the simplest possible guess: the same week last year.</w:t>
+      </w:r>
+    </w:p>
+    <w:tbl>
+      <w:tblPr>
+        <w:tblStyle w:val="TableGrid"/>
+        <w:tblW w:type="auto" w:w="0"/>
+        <w:jc w:val="center"/>
+        <w:tblLook w:firstColumn="1" w:firstRow="1" w:lastColumn="0" w:lastRow="0" w:noHBand="0" w:noVBand="1" w:val="04A0"/>
+      </w:tblPr>
+      <w:tblGrid>
+        <w:gridCol w:w="3120"/>
+        <w:gridCol w:w="3120"/>
+        <w:gridCol w:w="3120"/>
+      </w:tblGrid>
+      <w:tr>
+        <w:trPr>
+          <w:tblHeader w:val="true"/>
+        </w:trPr>
+        <w:tc>
+          <w:tcPr>
+            <w:tcW w:type="dxa" w:w="2016"/>
+            <w:shd w:val="clear" w:color="auto" w:fill="DBEAFE"/>
+          </w:tcPr>
+          <w:p>
+            <w:pPr>
+              <w:keepNext/>
+            </w:pPr>
+            <w:r/>
+            <w:r>
+              <w:rPr>
+                <w:b/>
+                <w:sz w:val="18"/>
+              </w:rPr>
+            </w:r>
+          </w:p>
+        </w:tc>
+        <w:tc>
+          <w:tcPr>
+            <w:tcW w:type="dxa" w:w="3600"/>
+            <w:shd w:val="clear" w:color="auto" w:fill="DBEAFE"/>
+          </w:tcPr>
+          <w:p>
+            <w:pPr>
+              <w:keepNext/>
+            </w:pPr>
+            <w:r/>
+            <w:r>
+              <w:rPr>
+                <w:b/>
+                <w:sz w:val="18"/>
+              </w:rPr>
+              <w:t>Test 1: two-year test (display check)</w:t>
+            </w:r>
+          </w:p>
+        </w:tc>
+        <w:tc>
+          <w:tcPr>
+            <w:tcW w:type="dxa" w:w="3744"/>
+            <w:shd w:val="clear" w:color="auto" w:fill="DBEAFE"/>
+          </w:tcPr>
+          <w:p>
+            <w:pPr>
+              <w:keepNext/>
+            </w:pPr>
+            <w:r/>
+            <w:r>
+              <w:rPr>
+                <w:b/>
+                <w:sz w:val="18"/>
+              </w:rPr>
+              <w:t>Test 2: four-week test (how the dashboard is used)</w:t>
+            </w:r>
+          </w:p>
+        </w:tc>
+      </w:tr>
+      <w:tr>
+        <w:tc>
+          <w:tcPr>
+            <w:tcW w:type="dxa" w:w="2016"/>
+          </w:tcPr>
+          <w:p>
+            <w:pPr>
+              <w:keepNext/>
+            </w:pPr>
+            <w:r/>
+            <w:r>
+              <w:rPr>
+                <w:sz w:val="18"/>
+              </w:rPr>
+              <w:t>Model learns from</w:t>
+            </w:r>
+          </w:p>
+        </w:tc>
+        <w:tc>
+          <w:tcPr>
+            <w:tcW w:type="dxa" w:w="3600"/>
+          </w:tcPr>
+          <w:p>
+            <w:pPr>
+              <w:keepNext/>
+            </w:pPr>
+            <w:r/>
+            <w:r>
+              <w:rPr>
+                <w:sz w:val="18"/>
+              </w:rPr>
+              <w:t>2010 to 2023</w:t>
+            </w:r>
+          </w:p>
+        </w:tc>
+        <w:tc>
+          <w:tcPr>
+            <w:tcW w:type="dxa" w:w="3744"/>
+          </w:tcPr>
+          <w:p>
+            <w:pPr>
+              <w:keepNext/>
+            </w:pPr>
+            <w:r/>
+            <w:r>
+              <w:rPr>
+                <w:sz w:val="18"/>
+              </w:rPr>
+              <w:t>All weeks before the forecast date (moves forward through 2024-2025)</w:t>
+            </w:r>
+          </w:p>
+        </w:tc>
+      </w:tr>
+      <w:tr>
+        <w:tc>
+          <w:tcPr>
+            <w:tcW w:type="dxa" w:w="2016"/>
+          </w:tcPr>
+          <w:p>
+            <w:pPr>
+              <w:keepNext/>
+            </w:pPr>
+            <w:r/>
+            <w:r>
+              <w:rPr>
+                <w:sz w:val="18"/>
+              </w:rPr>
+              <w:t>Hidden from the model</w:t>
+            </w:r>
+          </w:p>
+        </w:tc>
+        <w:tc>
+          <w:tcPr>
+            <w:tcW w:type="dxa" w:w="3600"/>
+          </w:tcPr>
+          <w:p>
+            <w:pPr>
+              <w:keepNext/>
+            </w:pPr>
+            <w:r/>
+            <w:r>
+              <w:rPr>
+                <w:sz w:val="18"/>
+              </w:rPr>
+              <w:t>2024 and 2025</w:t>
+            </w:r>
+          </w:p>
+        </w:tc>
+        <w:tc>
+          <w:tcPr>
+            <w:tcW w:type="dxa" w:w="3744"/>
+          </w:tcPr>
+          <w:p>
+            <w:pPr>
+              <w:keepNext/>
+            </w:pPr>
+            <w:r/>
+            <w:r>
+              <w:rPr>
+                <w:sz w:val="18"/>
+              </w:rPr>
+              <w:t>The 4 weeks being predicted</w:t>
+            </w:r>
+          </w:p>
+        </w:tc>
+      </w:tr>
+      <w:tr>
+        <w:tc>
+          <w:tcPr>
+            <w:tcW w:type="dxa" w:w="2016"/>
+          </w:tcPr>
+          <w:p>
+            <w:pPr>
+              <w:keepNext/>
+            </w:pPr>
+            <w:r/>
+            <w:r>
+              <w:rPr>
+                <w:sz w:val="18"/>
+              </w:rPr>
+              <w:t>What it predicts</w:t>
+            </w:r>
+          </w:p>
+        </w:tc>
+        <w:tc>
+          <w:tcPr>
+            <w:tcW w:type="dxa" w:w="3600"/>
+          </w:tcPr>
+          <w:p>
+            <w:pPr>
+              <w:keepNext/>
+            </w:pPr>
+            <w:r/>
+            <w:r>
+              <w:rPr>
+                <w:sz w:val="18"/>
+              </w:rPr>
+              <w:t>All 104 weeks of 2024-2025 at once</w:t>
+            </w:r>
+          </w:p>
+        </w:tc>
+        <w:tc>
+          <w:tcPr>
+            <w:tcW w:type="dxa" w:w="3744"/>
+          </w:tcPr>
+          <w:p>
+            <w:pPr>
+              <w:keepNext/>
+            </w:pPr>
+            <w:r/>
+            <w:r>
+              <w:rPr>
+                <w:sz w:val="18"/>
+              </w:rPr>
+              <w:t>The next 4 weeks; repeated every 4 weeks (26 forecasts for dengue)</w:t>
+            </w:r>
+          </w:p>
+        </w:tc>
+      </w:tr>
+      <w:tr>
+        <w:tc>
+          <w:tcPr>
+            <w:tcW w:type="dxa" w:w="2016"/>
+          </w:tcPr>
+          <w:p>
+            <w:pPr>
+              <w:keepNext/>
+            </w:pPr>
+            <w:r/>
+            <w:r>
+              <w:rPr>
+                <w:sz w:val="18"/>
+              </w:rPr>
+              <w:t>Purpose</w:t>
+            </w:r>
+          </w:p>
+        </w:tc>
+        <w:tc>
+          <w:tcPr>
+            <w:tcW w:type="dxa" w:w="3600"/>
+          </w:tcPr>
+          <w:p>
+            <w:pPr>
+              <w:keepNext/>
+            </w:pPr>
+            <w:r/>
+            <w:r>
+              <w:rPr>
+                <w:sz w:val="18"/>
+              </w:rPr>
+              <w:t>Decides whether a forecast is shown on the dashboard</w:t>
+            </w:r>
+          </w:p>
+        </w:tc>
+        <w:tc>
+          <w:tcPr>
+            <w:tcW w:type="dxa" w:w="3744"/>
+          </w:tcPr>
+          <w:p>
+            <w:pPr>
+              <w:keepNext/>
+            </w:pPr>
+            <w:r/>
+            <w:r>
+              <w:rPr>
+                <w:sz w:val="18"/>
+              </w:rPr>
+              <w:t>Measures the accuracy CESU actually sees: 1 to 4 weeks ahead</w:t>
+            </w:r>
+          </w:p>
+        </w:tc>
+      </w:tr>
+      <w:tr>
+        <w:tc>
+          <w:tcPr>
+            <w:tcW w:type="dxa" w:w="2016"/>
+          </w:tcPr>
+          <w:p>
+            <w:r/>
+            <w:r>
+              <w:rPr>
+                <w:sz w:val="18"/>
+              </w:rPr>
+              <w:t>Results</w:t>
+            </w:r>
+          </w:p>
+        </w:tc>
+        <w:tc>
+          <w:tcPr>
+            <w:tcW w:type="dxa" w:w="3600"/>
+          </w:tcPr>
+          <w:p>
+            <w:r/>
+            <w:r>
+              <w:rPr>
+                <w:sz w:val="18"/>
+              </w:rPr>
+              <w:t>Section 4 and Section 6.1</w:t>
+            </w:r>
+          </w:p>
+        </w:tc>
+        <w:tc>
+          <w:tcPr>
+            <w:tcW w:type="dxa" w:w="3744"/>
+          </w:tcPr>
+          <w:p>
+            <w:r/>
+            <w:r>
+              <w:rPr>
+                <w:sz w:val="18"/>
+              </w:rPr>
+              <w:t>Section 6.2</w:t>
+            </w:r>
+          </w:p>
+        </w:tc>
+      </w:tr>
+    </w:tbl>
+    <w:p/>
+    <w:p>
+      <w:r>
+        <w:rPr>
+          <w:i w:val="0"/>
+        </w:rPr>
+        <w:t>After Test 1, each model is retrained on all of 2010 to 2025 and that final model is what the dashboard uses. Test 2 was run separately for this guide, with the same settings as the dashboard models.</w:t>
+      </w:r>
+    </w:p>
+    <w:p>
+      <w:pPr>
+        <w:pStyle w:val="Heading1"/>
+      </w:pPr>
+      <w:r>
+        <w:t>4. When H-MAP shows a forecast and when it does not</w:t>
+      </w:r>
+    </w:p>
+    <w:p>
+      <w:r>
+        <w:rPr>
+          <w:i w:val="0"/>
+        </w:rPr>
+        <w:t>Before a forecast is shown, H-MAP runs Test 1. The model is trained on 2010 to 2023 only, asked to predict 2024 and 2025, and compared with what actually happened. The same test is given to the simplest possible guess: the same week last year. If Prophet does not beat that guess, the forecast is withheld and the dashboard says so.</w:t>
       </w:r>
     </w:p>
     <w:tbl>
@@ -1353,7 +2498,7 @@
         <w:pStyle w:val="Heading1"/>
       </w:pPr>
       <w:r>
-        <w:t>4. How the CESU should read the forecast</w:t>
+        <w:t>5. How the CESU should read the forecast</w:t>
       </w:r>
     </w:p>
     <w:p>
@@ -1639,7 +2784,7 @@
         <w:pStyle w:val="Heading1"/>
       </w:pPr>
       <w:r>
-        <w:t>5. How accurate it has been on Parañaque data</w:t>
+        <w:t>6. How accurate it has been on Parañaque data</w:t>
       </w:r>
     </w:p>
     <w:p>
@@ -1647,7 +2792,7 @@
         <w:pStyle w:val="Heading2"/>
       </w:pPr>
       <w:r>
-        <w:t>5.1 Two-year test (the display check)</w:t>
+        <w:t>6.1 Two-year test (the display check)</w:t>
       </w:r>
     </w:p>
     <w:p>
@@ -1655,7 +2800,7 @@
         <w:rPr>
           <w:i w:val="0"/>
         </w:rPr>
-        <w:t>Figure 1 shows the test from Section 3 for dengue: one forecast made at the end of 2023 for every week of 2024 and 2025. Prophet caught the timing of both rainy seasons and missed less than the same-week-last-year guess (RMSE 20.2 against 27.6 cases per week). It did not foresee the size of the 2024 season: actual cases reached about 91 a week while the forecast peaked near 33. A forecast made far ahead knows when the season comes, not how big it will be. 71% of the actual weeks fell inside the 80% range, so the range is somewhat narrower than it claims: treat it as the typical range, not a guarantee.</w:t>
+        <w:t>Figure 1 shows Test 1 for dengue: one forecast made at the end of 2023 for every week of 2024 and 2025. Prophet caught the timing of both rainy seasons and missed less than the same-week-last-year guess (RMSE 20.2 against 27.6 cases per week). It did not foresee the size of the 2024 season: actual cases reached about 91 a week while the forecast peaked near 33. A forecast made far ahead knows when the season comes, not how big it will be. 71% of the actual weeks fell inside the 80% range, so the range is somewhat narrower than it claims: treat it as the typical range, not a guarantee.</w:t>
       </w:r>
     </w:p>
     <w:p>
@@ -1714,7 +2859,7 @@
         <w:pStyle w:val="Heading2"/>
       </w:pPr>
       <w:r>
-        <w:t>5.2 Four-week test (how the dashboard is used)</w:t>
+        <w:t>6.2 Four-week test (how the dashboard is used)</w:t>
       </w:r>
     </w:p>
     <w:p>
@@ -2333,7 +3478,7 @@
         <w:pStyle w:val="Heading2"/>
       </w:pPr>
       <w:r>
-        <w:t>5.3 Barangay-level dengue forecasts</w:t>
+        <w:t>6.3 Barangay-level dengue forecasts</w:t>
       </w:r>
     </w:p>
     <w:tbl>
@@ -3730,7 +4875,115 @@
         <w:pStyle w:val="Heading1"/>
       </w:pPr>
       <w:r>
-        <w:t>6. Summary for the CESU</w:t>
+        <w:t>7. What has not been tested yet</w:t>
+      </w:r>
+    </w:p>
+    <w:p>
+      <w:r>
+        <w:rPr>
+          <w:i w:val="0"/>
+        </w:rPr>
+        <w:t>Both tests were scored after the fact, on 2024 and 2025. No forecast has yet been made in real time and then checked against the weeks that followed. Two things are still open:</w:t>
+      </w:r>
+    </w:p>
+    <w:p>
+      <w:pPr>
+        <w:pStyle w:val="ListBullet"/>
+      </w:pPr>
+      <w:r>
+        <w:rPr>
+          <w:b/>
+        </w:rPr>
+        <w:t xml:space="preserve">No live check on 2026. </w:t>
+      </w:r>
+      <w:r>
+        <w:t>The dashboard models stop at December 2025, so a forecast for late 2026 rests on the usual yearly pattern and not on how 2026 has gone so far. The dashboard shows a note when this gap is large.</w:t>
+      </w:r>
+    </w:p>
+    <w:p>
+      <w:pPr>
+        <w:pStyle w:val="ListBullet"/>
+      </w:pPr>
+      <w:r>
+        <w:rPr>
+          <w:b/>
+        </w:rPr>
+        <w:t xml:space="preserve">The dashboard forecast always starts from today. </w:t>
+      </w:r>
+      <w:r>
+        <w:t>It does not follow the year and week chosen in the dashboard filters, so it should be compared with the coming reports of the current year, not with the chart of an earlier year.</w:t>
+      </w:r>
+    </w:p>
+    <w:p>
+      <w:r>
+        <w:rPr>
+          <w:i w:val="0"/>
+        </w:rPr>
+        <w:t>Recommended live validation during deployment:</w:t>
+      </w:r>
+    </w:p>
+    <w:p>
+      <w:pPr>
+        <w:pStyle w:val="ListBullet"/>
+      </w:pPr>
+      <w:r>
+        <w:rPr>
+          <w:b/>
+        </w:rPr>
+        <w:t xml:space="preserve">Step 1. </w:t>
+      </w:r>
+      <w:r>
+        <w:t>Load each new PIDSR workbook and retrain the models (python ml/train_prophet.py), at least monthly.</w:t>
+      </w:r>
+    </w:p>
+    <w:p>
+      <w:pPr>
+        <w:pStyle w:val="ListBullet"/>
+      </w:pPr>
+      <w:r>
+        <w:rPr>
+          <w:b/>
+        </w:rPr>
+        <w:t xml:space="preserve">Step 2. </w:t>
+      </w:r>
+      <w:r>
+        <w:t>Save every four-week forecast on the day it is made (date, disease, morbidity weeks, predicted cases and 80% range).</w:t>
+      </w:r>
+    </w:p>
+    <w:p>
+      <w:pPr>
+        <w:pStyle w:val="ListBullet"/>
+      </w:pPr>
+      <w:r>
+        <w:rPr>
+          <w:b/>
+        </w:rPr>
+        <w:t xml:space="preserve">Step 3. </w:t>
+      </w:r>
+      <w:r>
+        <w:t>When those morbidity weeks have been fully reported (allow two weeks for late reports), compare them with the saved forecast using the same measures as Test 2: average miss, MAPE, weeks inside the 80% range, and whether the direction was correct.</w:t>
+      </w:r>
+    </w:p>
+    <w:p>
+      <w:pPr>
+        <w:pStyle w:val="ListBullet"/>
+      </w:pPr>
+      <w:r>
+        <w:rPr>
+          <w:b/>
+        </w:rPr>
+        <w:t xml:space="preserve">Step 4. </w:t>
+      </w:r>
+      <w:r>
+        <w:t>Review the running results each quarter. If a disease stops beating the same-week-last-year guess, withhold its forecast, as the display check already does.</w:t>
+      </w:r>
+    </w:p>
+    <w:p>
+      <w:pPr>
+        <w:pStyle w:val="Heading1"/>
+      </w:pPr>
+      <w:r>
+        <w:t>8. Summary for the CESU</w:t>
       </w:r>
     </w:p>
     <w:p>
@@ -3774,12 +5027,20 @@
       </w:r>
     </w:p>
     <w:p>
+      <w:pPr>
+        <w:pStyle w:val="ListBullet"/>
+      </w:pPr>
+      <w:r>
+        <w:t>The models learned from 2010 to 2025 and were tested on 2024-2025 weeks they had not seen; a live check on 2026 forecasts is the next step (Section 7).</w:t>
+      </w:r>
+    </w:p>
+    <w:p>
       <w:r>
         <w:rPr>
           <w:i/>
           <w:sz w:val="19"/>
         </w:rPr>
-        <w:t>Notes on the figures. The display-check figures in Section 3 come from the stored evaluation (ml/reports/prophet_eval_latest.csv). The four-week test and Figures 1 and 2 were rerun on the current database for this guide; the dengue two-year error there is 51.0% (stored value 50.1%). The small difference comes from the reloaded case data.</w:t>
+        <w:t>Notes on the figures. The display-check figures in Section 4 come from the stored evaluation (ml/reports/prophet_eval_latest.csv). The four-week test and Figures 1 and 2 were rerun on the current database for this guide; the dengue two-year error there is 51.0% (stored value 50.1%). The small difference comes from the reloaded case data.</w:t>
       </w:r>
     </w:p>
     <w:p>

</xml_diff>